<commit_message>
Add M365 Copilot competitive comparison section to submission docs
Added Section 5 to both .md and .docx covering:
- Full feature comparison table vs M365 Copilot
- Governance model difference (approved docs only vs all files)
- Citation-level accountability comparison
- Cost breakdown (100 users = $36k Copilot vs ~$200 ours)
- Pitch line for demo presentation

Co-Authored-By: Claude Sonnet 4.6 <noreply@anthropic.com>
</commit_message>
<xml_diff>
--- a/IDEATHON_SUBMISSION.docx
+++ b/IDEATHON_SUBMISSION.docx
@@ -3446,6 +3446,1221 @@
       </w:r>
     </w:p>
     <w:p>
+      <w:r>
+        <w:br w:type="page"/>
+      </w:r>
+    </w:p>
+    <w:p/>
+    <w:p>
+      <w:pPr>
+        <w:spacing w:after="40" w:before="240"/>
+      </w:pPr>
+      <w:r>
+        <w:rPr>
+          <w:b/>
+          <w:color w:val="005670"/>
+          <w:sz w:val="32"/>
+        </w:rPr>
+        <w:t>5.  Competitive Differentiation — Why Not Just Use Microsoft 365 Copilot?</w:t>
+      </w:r>
+    </w:p>
+    <w:p>
+      <w:pPr>
+        <w:spacing w:before="0" w:after="160"/>
+        <w:pBdr>
+          <w:bottom w:val="single" w:sz="6" w:color="9B1B30"/>
+        </w:pBdr>
+      </w:pPr>
+    </w:p>
+    <w:p>
+      <w:pPr>
+        <w:spacing w:before="0" w:after="80"/>
+        <w:jc w:val="left"/>
+      </w:pPr>
+      <w:r>
+        <w:rPr>
+          <w:b w:val="0"/>
+          <w:i/>
+          <w:color w:val="231F20"/>
+          <w:sz w:val="22"/>
+        </w:rPr>
+        <w:t>A common question when evaluating this project: "Doesn't Microsoft 365 Copilot already do this?"</w:t>
+      </w:r>
+    </w:p>
+    <w:p>
+      <w:pPr>
+        <w:spacing w:before="0" w:after="200"/>
+        <w:jc w:val="left"/>
+      </w:pPr>
+      <w:r>
+        <w:rPr>
+          <w:b/>
+          <w:i w:val="0"/>
+          <w:color w:val="005670"/>
+          <w:sz w:val="22"/>
+        </w:rPr>
+        <w:t>The short answer: Copilot solves a similar problem space, but in a fundamentally different — and less governed — way.</w:t>
+      </w:r>
+    </w:p>
+    <w:p>
+      <w:pPr>
+        <w:spacing w:before="0" w:after="80"/>
+        <w:jc w:val="left"/>
+      </w:pPr>
+      <w:r>
+        <w:rPr>
+          <w:b/>
+          <w:i w:val="0"/>
+          <w:color w:val="005670"/>
+          <w:sz w:val="24"/>
+        </w:rPr>
+        <w:t>Feature Comparison</w:t>
+      </w:r>
+    </w:p>
+    <w:tbl>
+      <w:tblPr>
+        <w:tblW w:type="auto" w:w="0"/>
+        <w:jc w:val="left"/>
+        <w:tblLook w:firstColumn="1" w:firstRow="1" w:lastColumn="0" w:lastRow="0" w:noHBand="0" w:noVBand="1" w:val="04A0"/>
+        <w:tblBorders>
+          <w:top w:val="single" w:sz="4" w:color="D0D0D0"/>
+          <w:left w:val="single" w:sz="4" w:color="D0D0D0"/>
+          <w:bottom w:val="single" w:sz="4" w:color="D0D0D0"/>
+          <w:right w:val="single" w:sz="4" w:color="D0D0D0"/>
+          <w:insideH w:val="single" w:sz="4" w:color="D0D0D0"/>
+          <w:insideV w:val="single" w:sz="4" w:color="D0D0D0"/>
+        </w:tblBorders>
+      </w:tblPr>
+      <w:tblGrid>
+        <w:gridCol w:w="3135"/>
+        <w:gridCol w:w="3135"/>
+        <w:gridCol w:w="3135"/>
+      </w:tblGrid>
+      <w:tr>
+        <w:tc>
+          <w:tcPr>
+            <w:tcW w:type="dxa" w:w="2592"/>
+            <w:shd w:val="clear" w:color="auto" w:fill="005670"/>
+          </w:tcPr>
+          <w:p>
+            <w:pPr>
+              <w:spacing w:before="60" w:after="60"/>
+            </w:pPr>
+            <w:r>
+              <w:rPr>
+                <w:b/>
+                <w:color w:val="FFFFFF"/>
+                <w:sz w:val="20"/>
+              </w:rPr>
+              <w:t>Feature</w:t>
+            </w:r>
+          </w:p>
+        </w:tc>
+        <w:tc>
+          <w:tcPr>
+            <w:tcW w:type="dxa" w:w="3312"/>
+            <w:shd w:val="clear" w:color="auto" w:fill="005670"/>
+          </w:tcPr>
+          <w:p>
+            <w:pPr>
+              <w:spacing w:before="60" w:after="60"/>
+            </w:pPr>
+            <w:r>
+              <w:rPr>
+                <w:b/>
+                <w:color w:val="FFFFFF"/>
+                <w:sz w:val="20"/>
+              </w:rPr>
+              <w:t>M365 Copilot</w:t>
+            </w:r>
+          </w:p>
+        </w:tc>
+        <w:tc>
+          <w:tcPr>
+            <w:tcW w:type="dxa" w:w="3456"/>
+            <w:shd w:val="clear" w:color="auto" w:fill="005670"/>
+          </w:tcPr>
+          <w:p>
+            <w:pPr>
+              <w:spacing w:before="60" w:after="60"/>
+            </w:pPr>
+            <w:r>
+              <w:rPr>
+                <w:b/>
+                <w:color w:val="FFFFFF"/>
+                <w:sz w:val="20"/>
+              </w:rPr>
+              <w:t>Our System</w:t>
+            </w:r>
+          </w:p>
+        </w:tc>
+      </w:tr>
+      <w:tr>
+        <w:tc>
+          <w:tcPr>
+            <w:tcW w:type="dxa" w:w="2592"/>
+            <w:shd w:val="clear" w:color="auto" w:fill="E6F2F6"/>
+          </w:tcPr>
+          <w:p>
+            <w:pPr>
+              <w:spacing w:before="40" w:after="40"/>
+            </w:pPr>
+            <w:r>
+              <w:rPr>
+                <w:color w:val="231F20"/>
+                <w:sz w:val="20"/>
+              </w:rPr>
+              <w:t>Cost</w:t>
+            </w:r>
+          </w:p>
+        </w:tc>
+        <w:tc>
+          <w:tcPr>
+            <w:tcW w:type="dxa" w:w="3312"/>
+            <w:shd w:val="clear" w:color="auto" w:fill="E6F2F6"/>
+          </w:tcPr>
+          <w:p>
+            <w:pPr>
+              <w:spacing w:before="40" w:after="40"/>
+            </w:pPr>
+            <w:r>
+              <w:rPr>
+                <w:color w:val="231F20"/>
+                <w:sz w:val="20"/>
+              </w:rPr>
+              <w:t>~$30/user/month ($360/user/year)</w:t>
+            </w:r>
+          </w:p>
+        </w:tc>
+        <w:tc>
+          <w:tcPr>
+            <w:tcW w:type="dxa" w:w="3456"/>
+            <w:shd w:val="clear" w:color="auto" w:fill="E6F2F6"/>
+          </w:tcPr>
+          <w:p>
+            <w:pPr>
+              <w:spacing w:before="40" w:after="40"/>
+            </w:pPr>
+            <w:r>
+              <w:rPr>
+                <w:color w:val="231F20"/>
+                <w:sz w:val="20"/>
+              </w:rPr>
+              <w:t>GCP pay-per-use (cents per query)</w:t>
+            </w:r>
+          </w:p>
+        </w:tc>
+      </w:tr>
+      <w:tr>
+        <w:tc>
+          <w:tcPr>
+            <w:tcW w:type="dxa" w:w="2592"/>
+            <w:shd w:val="clear" w:color="auto" w:fill="FFFFFF"/>
+          </w:tcPr>
+          <w:p>
+            <w:pPr>
+              <w:spacing w:before="40" w:after="40"/>
+            </w:pPr>
+            <w:r>
+              <w:rPr>
+                <w:color w:val="231F20"/>
+                <w:sz w:val="20"/>
+              </w:rPr>
+              <w:t>Document scope</w:t>
+            </w:r>
+          </w:p>
+        </w:tc>
+        <w:tc>
+          <w:tcPr>
+            <w:tcW w:type="dxa" w:w="3312"/>
+            <w:shd w:val="clear" w:color="auto" w:fill="FFFFFF"/>
+          </w:tcPr>
+          <w:p>
+            <w:pPr>
+              <w:spacing w:before="40" w:after="40"/>
+            </w:pPr>
+            <w:r>
+              <w:rPr>
+                <w:color w:val="231F20"/>
+                <w:sz w:val="20"/>
+              </w:rPr>
+              <w:t>Searches ALL files user can access</w:t>
+            </w:r>
+          </w:p>
+        </w:tc>
+        <w:tc>
+          <w:tcPr>
+            <w:tcW w:type="dxa" w:w="3456"/>
+            <w:shd w:val="clear" w:color="auto" w:fill="FFFFFF"/>
+          </w:tcPr>
+          <w:p>
+            <w:pPr>
+              <w:spacing w:before="40" w:after="40"/>
+            </w:pPr>
+            <w:r>
+              <w:rPr>
+                <w:color w:val="231F20"/>
+                <w:sz w:val="20"/>
+              </w:rPr>
+              <w:t>Only explicitly approved documents</w:t>
+            </w:r>
+          </w:p>
+        </w:tc>
+      </w:tr>
+      <w:tr>
+        <w:tc>
+          <w:tcPr>
+            <w:tcW w:type="dxa" w:w="2592"/>
+            <w:shd w:val="clear" w:color="auto" w:fill="E6F2F6"/>
+          </w:tcPr>
+          <w:p>
+            <w:pPr>
+              <w:spacing w:before="40" w:after="40"/>
+            </w:pPr>
+            <w:r>
+              <w:rPr>
+                <w:color w:val="231F20"/>
+                <w:sz w:val="20"/>
+              </w:rPr>
+              <w:t>Citation level</w:t>
+            </w:r>
+          </w:p>
+        </w:tc>
+        <w:tc>
+          <w:tcPr>
+            <w:tcW w:type="dxa" w:w="3312"/>
+            <w:shd w:val="clear" w:color="auto" w:fill="E6F2F6"/>
+          </w:tcPr>
+          <w:p>
+            <w:pPr>
+              <w:spacing w:before="40" w:after="40"/>
+            </w:pPr>
+            <w:r>
+              <w:rPr>
+                <w:color w:val="231F20"/>
+                <w:sz w:val="20"/>
+              </w:rPr>
+              <w:t>General "based on your files"</w:t>
+            </w:r>
+          </w:p>
+        </w:tc>
+        <w:tc>
+          <w:tcPr>
+            <w:tcW w:type="dxa" w:w="3456"/>
+            <w:shd w:val="clear" w:color="auto" w:fill="E6F2F6"/>
+          </w:tcPr>
+          <w:p>
+            <w:pPr>
+              <w:spacing w:before="40" w:after="40"/>
+            </w:pPr>
+            <w:r>
+              <w:rPr>
+                <w:color w:val="231F20"/>
+                <w:sz w:val="20"/>
+              </w:rPr>
+              <w:t>Numbered [1] citations per sentence</w:t>
+            </w:r>
+          </w:p>
+        </w:tc>
+      </w:tr>
+      <w:tr>
+        <w:tc>
+          <w:tcPr>
+            <w:tcW w:type="dxa" w:w="2592"/>
+            <w:shd w:val="clear" w:color="auto" w:fill="FFFFFF"/>
+          </w:tcPr>
+          <w:p>
+            <w:pPr>
+              <w:spacing w:before="40" w:after="40"/>
+            </w:pPr>
+            <w:r>
+              <w:rPr>
+                <w:color w:val="231F20"/>
+                <w:sz w:val="20"/>
+              </w:rPr>
+              <w:t>Confidence scoring</w:t>
+            </w:r>
+          </w:p>
+        </w:tc>
+        <w:tc>
+          <w:tcPr>
+            <w:tcW w:type="dxa" w:w="3312"/>
+            <w:shd w:val="clear" w:color="auto" w:fill="FFFFFF"/>
+          </w:tcPr>
+          <w:p>
+            <w:pPr>
+              <w:spacing w:before="40" w:after="40"/>
+            </w:pPr>
+            <w:r>
+              <w:rPr>
+                <w:color w:val="231F20"/>
+                <w:sz w:val="20"/>
+              </w:rPr>
+              <w:t>None</w:t>
+            </w:r>
+          </w:p>
+        </w:tc>
+        <w:tc>
+          <w:tcPr>
+            <w:tcW w:type="dxa" w:w="3456"/>
+            <w:shd w:val="clear" w:color="auto" w:fill="FFFFFF"/>
+          </w:tcPr>
+          <w:p>
+            <w:pPr>
+              <w:spacing w:before="40" w:after="40"/>
+            </w:pPr>
+            <w:r>
+              <w:rPr>
+                <w:color w:val="231F20"/>
+                <w:sz w:val="20"/>
+              </w:rPr>
+              <w:t>FULL / PARTIAL / NO SUPPORT</w:t>
+            </w:r>
+          </w:p>
+        </w:tc>
+      </w:tr>
+      <w:tr>
+        <w:tc>
+          <w:tcPr>
+            <w:tcW w:type="dxa" w:w="2592"/>
+            <w:shd w:val="clear" w:color="auto" w:fill="E6F2F6"/>
+          </w:tcPr>
+          <w:p>
+            <w:pPr>
+              <w:spacing w:before="40" w:after="40"/>
+            </w:pPr>
+            <w:r>
+              <w:rPr>
+                <w:color w:val="231F20"/>
+                <w:sz w:val="20"/>
+              </w:rPr>
+              <w:t>Governance control</w:t>
+            </w:r>
+          </w:p>
+        </w:tc>
+        <w:tc>
+          <w:tcPr>
+            <w:tcW w:type="dxa" w:w="3312"/>
+            <w:shd w:val="clear" w:color="auto" w:fill="E6F2F6"/>
+          </w:tcPr>
+          <w:p>
+            <w:pPr>
+              <w:spacing w:before="40" w:after="40"/>
+            </w:pPr>
+            <w:r>
+              <w:rPr>
+                <w:color w:val="231F20"/>
+                <w:sz w:val="20"/>
+              </w:rPr>
+              <w:t>Microsoft controls the stack</w:t>
+            </w:r>
+          </w:p>
+        </w:tc>
+        <w:tc>
+          <w:tcPr>
+            <w:tcW w:type="dxa" w:w="3456"/>
+            <w:shd w:val="clear" w:color="auto" w:fill="E6F2F6"/>
+          </w:tcPr>
+          <w:p>
+            <w:pPr>
+              <w:spacing w:before="40" w:after="40"/>
+            </w:pPr>
+            <w:r>
+              <w:rPr>
+                <w:color w:val="231F20"/>
+                <w:sz w:val="20"/>
+              </w:rPr>
+              <w:t>100% isolated in Stewart's GCP project</w:t>
+            </w:r>
+          </w:p>
+        </w:tc>
+      </w:tr>
+      <w:tr>
+        <w:tc>
+          <w:tcPr>
+            <w:tcW w:type="dxa" w:w="2592"/>
+            <w:shd w:val="clear" w:color="auto" w:fill="FFFFFF"/>
+          </w:tcPr>
+          <w:p>
+            <w:pPr>
+              <w:spacing w:before="40" w:after="40"/>
+            </w:pPr>
+            <w:r>
+              <w:rPr>
+                <w:color w:val="231F20"/>
+                <w:sz w:val="20"/>
+              </w:rPr>
+              <w:t>Approval workflow</w:t>
+            </w:r>
+          </w:p>
+        </w:tc>
+        <w:tc>
+          <w:tcPr>
+            <w:tcW w:type="dxa" w:w="3312"/>
+            <w:shd w:val="clear" w:color="auto" w:fill="FFFFFF"/>
+          </w:tcPr>
+          <w:p>
+            <w:pPr>
+              <w:spacing w:before="40" w:after="40"/>
+            </w:pPr>
+            <w:r>
+              <w:rPr>
+                <w:color w:val="231F20"/>
+                <w:sz w:val="20"/>
+              </w:rPr>
+              <w:t>No document gating</w:t>
+            </w:r>
+          </w:p>
+        </w:tc>
+        <w:tc>
+          <w:tcPr>
+            <w:tcW w:type="dxa" w:w="3456"/>
+            <w:shd w:val="clear" w:color="auto" w:fill="FFFFFF"/>
+          </w:tcPr>
+          <w:p>
+            <w:pPr>
+              <w:spacing w:before="40" w:after="40"/>
+            </w:pPr>
+            <w:r>
+              <w:rPr>
+                <w:color w:val="231F20"/>
+                <w:sz w:val="20"/>
+              </w:rPr>
+              <w:t>Only approved docs can be cited</w:t>
+            </w:r>
+          </w:p>
+        </w:tc>
+      </w:tr>
+      <w:tr>
+        <w:tc>
+          <w:tcPr>
+            <w:tcW w:type="dxa" w:w="2592"/>
+            <w:shd w:val="clear" w:color="auto" w:fill="E6F2F6"/>
+          </w:tcPr>
+          <w:p>
+            <w:pPr>
+              <w:spacing w:before="40" w:after="40"/>
+            </w:pPr>
+            <w:r>
+              <w:rPr>
+                <w:color w:val="231F20"/>
+                <w:sz w:val="20"/>
+              </w:rPr>
+              <w:t>Custom branding</w:t>
+            </w:r>
+          </w:p>
+        </w:tc>
+        <w:tc>
+          <w:tcPr>
+            <w:tcW w:type="dxa" w:w="3312"/>
+            <w:shd w:val="clear" w:color="auto" w:fill="E6F2F6"/>
+          </w:tcPr>
+          <w:p>
+            <w:pPr>
+              <w:spacing w:before="40" w:after="40"/>
+            </w:pPr>
+            <w:r>
+              <w:rPr>
+                <w:color w:val="231F20"/>
+                <w:sz w:val="20"/>
+              </w:rPr>
+              <w:t>Microsoft UI only</w:t>
+            </w:r>
+          </w:p>
+        </w:tc>
+        <w:tc>
+          <w:tcPr>
+            <w:tcW w:type="dxa" w:w="3456"/>
+            <w:shd w:val="clear" w:color="auto" w:fill="E6F2F6"/>
+          </w:tcPr>
+          <w:p>
+            <w:pPr>
+              <w:spacing w:before="40" w:after="40"/>
+            </w:pPr>
+            <w:r>
+              <w:rPr>
+                <w:color w:val="231F20"/>
+                <w:sz w:val="20"/>
+              </w:rPr>
+              <w:t>Full Stewart brand identity</w:t>
+            </w:r>
+          </w:p>
+        </w:tc>
+      </w:tr>
+      <w:tr>
+        <w:tc>
+          <w:tcPr>
+            <w:tcW w:type="dxa" w:w="2592"/>
+            <w:shd w:val="clear" w:color="auto" w:fill="FFFFFF"/>
+          </w:tcPr>
+          <w:p>
+            <w:pPr>
+              <w:spacing w:before="40" w:after="40"/>
+            </w:pPr>
+            <w:r>
+              <w:rPr>
+                <w:color w:val="231F20"/>
+                <w:sz w:val="20"/>
+              </w:rPr>
+              <w:t>Session analytics</w:t>
+            </w:r>
+          </w:p>
+        </w:tc>
+        <w:tc>
+          <w:tcPr>
+            <w:tcW w:type="dxa" w:w="3312"/>
+            <w:shd w:val="clear" w:color="auto" w:fill="FFFFFF"/>
+          </w:tcPr>
+          <w:p>
+            <w:pPr>
+              <w:spacing w:before="40" w:after="40"/>
+            </w:pPr>
+            <w:r>
+              <w:rPr>
+                <w:color w:val="231F20"/>
+                <w:sz w:val="20"/>
+              </w:rPr>
+              <w:t>None</w:t>
+            </w:r>
+          </w:p>
+        </w:tc>
+        <w:tc>
+          <w:tcPr>
+            <w:tcW w:type="dxa" w:w="3456"/>
+            <w:shd w:val="clear" w:color="auto" w:fill="FFFFFF"/>
+          </w:tcPr>
+          <w:p>
+            <w:pPr>
+              <w:spacing w:before="40" w:after="40"/>
+            </w:pPr>
+            <w:r>
+              <w:rPr>
+                <w:color w:val="231F20"/>
+                <w:sz w:val="20"/>
+              </w:rPr>
+              <w:t>Confidence breakdown + satisfaction rate</w:t>
+            </w:r>
+          </w:p>
+        </w:tc>
+      </w:tr>
+      <w:tr>
+        <w:tc>
+          <w:tcPr>
+            <w:tcW w:type="dxa" w:w="2592"/>
+            <w:shd w:val="clear" w:color="auto" w:fill="E6F2F6"/>
+          </w:tcPr>
+          <w:p>
+            <w:pPr>
+              <w:spacing w:before="40" w:after="40"/>
+            </w:pPr>
+            <w:r>
+              <w:rPr>
+                <w:color w:val="231F20"/>
+                <w:sz w:val="20"/>
+              </w:rPr>
+              <w:t>Follow-up suggestions</w:t>
+            </w:r>
+          </w:p>
+        </w:tc>
+        <w:tc>
+          <w:tcPr>
+            <w:tcW w:type="dxa" w:w="3312"/>
+            <w:shd w:val="clear" w:color="auto" w:fill="E6F2F6"/>
+          </w:tcPr>
+          <w:p>
+            <w:pPr>
+              <w:spacing w:before="40" w:after="40"/>
+            </w:pPr>
+            <w:r>
+              <w:rPr>
+                <w:color w:val="231F20"/>
+                <w:sz w:val="20"/>
+              </w:rPr>
+              <w:t>Basic</w:t>
+            </w:r>
+          </w:p>
+        </w:tc>
+        <w:tc>
+          <w:tcPr>
+            <w:tcW w:type="dxa" w:w="3456"/>
+            <w:shd w:val="clear" w:color="auto" w:fill="E6F2F6"/>
+          </w:tcPr>
+          <w:p>
+            <w:pPr>
+              <w:spacing w:before="40" w:after="40"/>
+            </w:pPr>
+            <w:r>
+              <w:rPr>
+                <w:color w:val="231F20"/>
+                <w:sz w:val="20"/>
+              </w:rPr>
+              <w:t>Context-aware, topic-specific chips</w:t>
+            </w:r>
+          </w:p>
+        </w:tc>
+      </w:tr>
+      <w:tr>
+        <w:tc>
+          <w:tcPr>
+            <w:tcW w:type="dxa" w:w="2592"/>
+            <w:shd w:val="clear" w:color="auto" w:fill="FFFFFF"/>
+          </w:tcPr>
+          <w:p>
+            <w:pPr>
+              <w:spacing w:before="40" w:after="40"/>
+            </w:pPr>
+            <w:r>
+              <w:rPr>
+                <w:color w:val="231F20"/>
+                <w:sz w:val="20"/>
+              </w:rPr>
+              <w:t>Vendor dependency</w:t>
+            </w:r>
+          </w:p>
+        </w:tc>
+        <w:tc>
+          <w:tcPr>
+            <w:tcW w:type="dxa" w:w="3312"/>
+            <w:shd w:val="clear" w:color="auto" w:fill="FFFFFF"/>
+          </w:tcPr>
+          <w:p>
+            <w:pPr>
+              <w:spacing w:before="40" w:after="40"/>
+            </w:pPr>
+            <w:r>
+              <w:rPr>
+                <w:color w:val="231F20"/>
+                <w:sz w:val="20"/>
+              </w:rPr>
+              <w:t>Deep Microsoft lock-in</w:t>
+            </w:r>
+          </w:p>
+        </w:tc>
+        <w:tc>
+          <w:tcPr>
+            <w:tcW w:type="dxa" w:w="3456"/>
+            <w:shd w:val="clear" w:color="auto" w:fill="FFFFFF"/>
+          </w:tcPr>
+          <w:p>
+            <w:pPr>
+              <w:spacing w:before="40" w:after="40"/>
+            </w:pPr>
+            <w:r>
+              <w:rPr>
+                <w:color w:val="231F20"/>
+                <w:sz w:val="20"/>
+              </w:rPr>
+              <w:t>Portable — any GCP service swappable</w:t>
+            </w:r>
+          </w:p>
+        </w:tc>
+      </w:tr>
+      <w:tr>
+        <w:tc>
+          <w:tcPr>
+            <w:tcW w:type="dxa" w:w="2592"/>
+            <w:shd w:val="clear" w:color="auto" w:fill="E6F2F6"/>
+          </w:tcPr>
+          <w:p>
+            <w:pPr>
+              <w:spacing w:before="40" w:after="40"/>
+            </w:pPr>
+            <w:r>
+              <w:rPr>
+                <w:color w:val="231F20"/>
+                <w:sz w:val="20"/>
+              </w:rPr>
+              <w:t>M365 license required</w:t>
+            </w:r>
+          </w:p>
+        </w:tc>
+        <w:tc>
+          <w:tcPr>
+            <w:tcW w:type="dxa" w:w="3312"/>
+            <w:shd w:val="clear" w:color="auto" w:fill="E6F2F6"/>
+          </w:tcPr>
+          <w:p>
+            <w:pPr>
+              <w:spacing w:before="40" w:after="40"/>
+            </w:pPr>
+            <w:r>
+              <w:rPr>
+                <w:color w:val="231F20"/>
+                <w:sz w:val="20"/>
+              </w:rPr>
+              <w:t>Yes — E3/E5 + Copilot add-on</w:t>
+            </w:r>
+          </w:p>
+        </w:tc>
+        <w:tc>
+          <w:tcPr>
+            <w:tcW w:type="dxa" w:w="3456"/>
+            <w:shd w:val="clear" w:color="auto" w:fill="E6F2F6"/>
+          </w:tcPr>
+          <w:p>
+            <w:pPr>
+              <w:spacing w:before="40" w:after="40"/>
+            </w:pPr>
+            <w:r>
+              <w:rPr>
+                <w:color w:val="231F20"/>
+                <w:sz w:val="20"/>
+              </w:rPr>
+              <w:t>No — open web + Slack</w:t>
+            </w:r>
+          </w:p>
+        </w:tc>
+      </w:tr>
+      <w:tr>
+        <w:tc>
+          <w:tcPr>
+            <w:tcW w:type="dxa" w:w="2592"/>
+            <w:shd w:val="clear" w:color="auto" w:fill="FFFFFF"/>
+          </w:tcPr>
+          <w:p>
+            <w:pPr>
+              <w:spacing w:before="40" w:after="40"/>
+            </w:pPr>
+            <w:r>
+              <w:rPr>
+                <w:color w:val="231F20"/>
+                <w:sz w:val="20"/>
+              </w:rPr>
+              <w:t>Data residency</w:t>
+            </w:r>
+          </w:p>
+        </w:tc>
+        <w:tc>
+          <w:tcPr>
+            <w:tcW w:type="dxa" w:w="3312"/>
+            <w:shd w:val="clear" w:color="auto" w:fill="FFFFFF"/>
+          </w:tcPr>
+          <w:p>
+            <w:pPr>
+              <w:spacing w:before="40" w:after="40"/>
+            </w:pPr>
+            <w:r>
+              <w:rPr>
+                <w:color w:val="231F20"/>
+                <w:sz w:val="20"/>
+              </w:rPr>
+              <w:t>Microsoft processes your data</w:t>
+            </w:r>
+          </w:p>
+        </w:tc>
+        <w:tc>
+          <w:tcPr>
+            <w:tcW w:type="dxa" w:w="3456"/>
+            <w:shd w:val="clear" w:color="auto" w:fill="FFFFFF"/>
+          </w:tcPr>
+          <w:p>
+            <w:pPr>
+              <w:spacing w:before="40" w:after="40"/>
+            </w:pPr>
+            <w:r>
+              <w:rPr>
+                <w:color w:val="231F20"/>
+                <w:sz w:val="20"/>
+              </w:rPr>
+              <w:t>Data never leaves your GCP project</w:t>
+            </w:r>
+          </w:p>
+        </w:tc>
+      </w:tr>
+    </w:tbl>
+    <w:p/>
+    <w:p>
+      <w:pPr>
+        <w:spacing w:before="0" w:after="80"/>
+        <w:jc w:val="left"/>
+      </w:pPr>
+      <w:r>
+        <w:rPr>
+          <w:b/>
+          <w:i w:val="0"/>
+          <w:color w:val="005670"/>
+          <w:sz w:val="24"/>
+        </w:rPr>
+        <w:t>The Core Governance Difference</w:t>
+      </w:r>
+    </w:p>
+    <w:p>
+      <w:pPr>
+        <w:spacing w:before="0" w:after="120"/>
+        <w:jc w:val="left"/>
+      </w:pPr>
+      <w:r>
+        <w:rPr>
+          <w:b w:val="0"/>
+          <w:i w:val="0"/>
+          <w:color w:val="231F20"/>
+          <w:sz w:val="22"/>
+        </w:rPr>
+        <w:t>Microsoft 365 Copilot searches everything a user has permission to access — SharePoint, OneDrive, emails, Teams chats. There is no document approval layer. A user asking about cloud infrastructure might get an answer pulled from an outdated email thread, an unapproved draft, or an irrelevant HR document.</w:t>
+      </w:r>
+    </w:p>
+    <w:p>
+      <w:pPr>
+        <w:spacing w:before="0" w:after="200"/>
+        <w:jc w:val="left"/>
+      </w:pPr>
+      <w:r>
+        <w:rPr>
+          <w:b/>
+          <w:i w:val="0"/>
+          <w:color w:val="005670"/>
+          <w:sz w:val="22"/>
+        </w:rPr>
+        <w:t>Our system inverts this: only documents that have been explicitly approved, ingested, and indexed can ever appear in an answer. This is a fundamentally different trust model — one that aligns with enterprise compliance, legal defensibility, and audit requirements.</w:t>
+      </w:r>
+    </w:p>
+    <w:p>
+      <w:pPr>
+        <w:spacing w:before="0" w:after="80"/>
+        <w:jc w:val="left"/>
+      </w:pPr>
+      <w:r>
+        <w:rPr>
+          <w:b/>
+          <w:i w:val="0"/>
+          <w:color w:val="005670"/>
+          <w:sz w:val="24"/>
+        </w:rPr>
+        <w:t>The Citation Difference</w:t>
+      </w:r>
+    </w:p>
+    <w:p>
+      <w:pPr>
+        <w:spacing w:before="0" w:after="80"/>
+        <w:jc w:val="left"/>
+      </w:pPr>
+      <w:r>
+        <w:rPr>
+          <w:b w:val="0"/>
+          <w:i w:val="0"/>
+          <w:color w:val="231F20"/>
+          <w:sz w:val="22"/>
+        </w:rPr>
+        <w:t>Copilot tells you an answer came "from your SharePoint files."</w:t>
+      </w:r>
+    </w:p>
+    <w:p>
+      <w:pPr>
+        <w:spacing w:before="0" w:after="200"/>
+        <w:jc w:val="left"/>
+      </w:pPr>
+      <w:r>
+        <w:rPr>
+          <w:b w:val="0"/>
+          <w:i/>
+          <w:color w:val="231F20"/>
+          <w:sz w:val="22"/>
+        </w:rPr>
+        <w:t>Our system tells you: "The Quarter Rack has 1440 GB RAM [1] — sourced from Cloud Infrastructure Guide, page 4." Every factual claim is numbered, every number links to a specific document card with title, URI, and the exact passage used. That is citation-level accountability that Copilot does not offer.</w:t>
+      </w:r>
+    </w:p>
+    <w:p>
+      <w:pPr>
+        <w:spacing w:before="0" w:after="80"/>
+        <w:jc w:val="left"/>
+      </w:pPr>
+      <w:r>
+        <w:rPr>
+          <w:b/>
+          <w:i w:val="0"/>
+          <w:color w:val="005670"/>
+          <w:sz w:val="24"/>
+        </w:rPr>
+        <w:t>The Cost Difference</w:t>
+      </w:r>
+    </w:p>
+    <w:tbl>
+      <w:tblPr>
+        <w:tblW w:type="auto" w:w="0"/>
+        <w:jc w:val="left"/>
+        <w:tblLook w:firstColumn="1" w:firstRow="1" w:lastColumn="0" w:lastRow="0" w:noHBand="0" w:noVBand="1" w:val="04A0"/>
+        <w:tblBorders>
+          <w:top w:val="single" w:sz="4" w:color="D0D0D0"/>
+          <w:left w:val="single" w:sz="4" w:color="D0D0D0"/>
+          <w:bottom w:val="single" w:sz="4" w:color="D0D0D0"/>
+          <w:right w:val="single" w:sz="4" w:color="D0D0D0"/>
+          <w:insideH w:val="single" w:sz="4" w:color="D0D0D0"/>
+          <w:insideV w:val="single" w:sz="4" w:color="D0D0D0"/>
+        </w:tblBorders>
+      </w:tblPr>
+      <w:tblGrid>
+        <w:gridCol w:w="3135"/>
+        <w:gridCol w:w="3135"/>
+        <w:gridCol w:w="3135"/>
+      </w:tblGrid>
+      <w:tr>
+        <w:tc>
+          <w:tcPr>
+            <w:tcW w:type="dxa" w:w="3168"/>
+            <w:shd w:val="clear" w:color="auto" w:fill="005670"/>
+          </w:tcPr>
+          <w:p>
+            <w:pPr>
+              <w:spacing w:before="60" w:after="60"/>
+            </w:pPr>
+            <w:r>
+              <w:rPr>
+                <w:b/>
+                <w:color w:val="FFFFFF"/>
+                <w:sz w:val="20"/>
+              </w:rPr>
+              <w:t>Scenario</w:t>
+            </w:r>
+          </w:p>
+        </w:tc>
+        <w:tc>
+          <w:tcPr>
+            <w:tcW w:type="dxa" w:w="3168"/>
+            <w:shd w:val="clear" w:color="auto" w:fill="005670"/>
+          </w:tcPr>
+          <w:p>
+            <w:pPr>
+              <w:spacing w:before="60" w:after="60"/>
+            </w:pPr>
+            <w:r>
+              <w:rPr>
+                <w:b/>
+                <w:color w:val="FFFFFF"/>
+                <w:sz w:val="20"/>
+              </w:rPr>
+              <w:t>M365 Copilot</w:t>
+            </w:r>
+          </w:p>
+        </w:tc>
+        <w:tc>
+          <w:tcPr>
+            <w:tcW w:type="dxa" w:w="3024"/>
+            <w:shd w:val="clear" w:color="auto" w:fill="005670"/>
+          </w:tcPr>
+          <w:p>
+            <w:pPr>
+              <w:spacing w:before="60" w:after="60"/>
+            </w:pPr>
+            <w:r>
+              <w:rPr>
+                <w:b/>
+                <w:color w:val="FFFFFF"/>
+                <w:sz w:val="20"/>
+              </w:rPr>
+              <w:t>Our System</w:t>
+            </w:r>
+          </w:p>
+        </w:tc>
+      </w:tr>
+      <w:tr>
+        <w:tc>
+          <w:tcPr>
+            <w:tcW w:type="dxa" w:w="3168"/>
+            <w:shd w:val="clear" w:color="auto" w:fill="E6F2F6"/>
+          </w:tcPr>
+          <w:p>
+            <w:pPr>
+              <w:spacing w:before="40" w:after="40"/>
+            </w:pPr>
+            <w:r>
+              <w:rPr>
+                <w:color w:val="231F20"/>
+                <w:sz w:val="20"/>
+              </w:rPr>
+              <w:t>100 users, 1 year</w:t>
+            </w:r>
+          </w:p>
+        </w:tc>
+        <w:tc>
+          <w:tcPr>
+            <w:tcW w:type="dxa" w:w="3168"/>
+            <w:shd w:val="clear" w:color="auto" w:fill="E6F2F6"/>
+          </w:tcPr>
+          <w:p>
+            <w:pPr>
+              <w:spacing w:before="40" w:after="40"/>
+            </w:pPr>
+            <w:r>
+              <w:rPr>
+                <w:color w:val="231F20"/>
+                <w:sz w:val="20"/>
+              </w:rPr>
+              <w:t>~$36,000</w:t>
+            </w:r>
+          </w:p>
+        </w:tc>
+        <w:tc>
+          <w:tcPr>
+            <w:tcW w:type="dxa" w:w="3024"/>
+            <w:shd w:val="clear" w:color="auto" w:fill="E6F2F6"/>
+          </w:tcPr>
+          <w:p>
+            <w:pPr>
+              <w:spacing w:before="40" w:after="40"/>
+            </w:pPr>
+            <w:r>
+              <w:rPr>
+                <w:color w:val="231F20"/>
+                <w:sz w:val="20"/>
+              </w:rPr>
+              <w:t>~$50–200 (GCP usage only)</w:t>
+            </w:r>
+          </w:p>
+        </w:tc>
+      </w:tr>
+      <w:tr>
+        <w:tc>
+          <w:tcPr>
+            <w:tcW w:type="dxa" w:w="3168"/>
+            <w:shd w:val="clear" w:color="auto" w:fill="FFFFFF"/>
+          </w:tcPr>
+          <w:p>
+            <w:pPr>
+              <w:spacing w:before="40" w:after="40"/>
+            </w:pPr>
+            <w:r>
+              <w:rPr>
+                <w:color w:val="231F20"/>
+                <w:sz w:val="20"/>
+              </w:rPr>
+              <w:t>Requires M365 E3/E5 license</w:t>
+            </w:r>
+          </w:p>
+        </w:tc>
+        <w:tc>
+          <w:tcPr>
+            <w:tcW w:type="dxa" w:w="3168"/>
+            <w:shd w:val="clear" w:color="auto" w:fill="FFFFFF"/>
+          </w:tcPr>
+          <w:p>
+            <w:pPr>
+              <w:spacing w:before="40" w:after="40"/>
+            </w:pPr>
+            <w:r>
+              <w:rPr>
+                <w:color w:val="231F20"/>
+                <w:sz w:val="20"/>
+              </w:rPr>
+              <w:t>Yes (~$36/user/month extra)</w:t>
+            </w:r>
+          </w:p>
+        </w:tc>
+        <w:tc>
+          <w:tcPr>
+            <w:tcW w:type="dxa" w:w="3024"/>
+            <w:shd w:val="clear" w:color="auto" w:fill="FFFFFF"/>
+          </w:tcPr>
+          <w:p>
+            <w:pPr>
+              <w:spacing w:before="40" w:after="40"/>
+            </w:pPr>
+            <w:r>
+              <w:rPr>
+                <w:color w:val="231F20"/>
+                <w:sz w:val="20"/>
+              </w:rPr>
+              <w:t>No</w:t>
+            </w:r>
+          </w:p>
+        </w:tc>
+      </w:tr>
+      <w:tr>
+        <w:tc>
+          <w:tcPr>
+            <w:tcW w:type="dxa" w:w="3168"/>
+            <w:shd w:val="clear" w:color="auto" w:fill="E6F2F6"/>
+          </w:tcPr>
+          <w:p>
+            <w:pPr>
+              <w:spacing w:before="40" w:after="40"/>
+            </w:pPr>
+            <w:r>
+              <w:rPr>
+                <w:color w:val="231F20"/>
+                <w:sz w:val="20"/>
+              </w:rPr>
+              <w:t>Per-query cost model</w:t>
+            </w:r>
+          </w:p>
+        </w:tc>
+        <w:tc>
+          <w:tcPr>
+            <w:tcW w:type="dxa" w:w="3168"/>
+            <w:shd w:val="clear" w:color="auto" w:fill="E6F2F6"/>
+          </w:tcPr>
+          <w:p>
+            <w:pPr>
+              <w:spacing w:before="40" w:after="40"/>
+            </w:pPr>
+            <w:r>
+              <w:rPr>
+                <w:color w:val="231F20"/>
+                <w:sz w:val="20"/>
+              </w:rPr>
+              <w:t>Flat subscription</w:t>
+            </w:r>
+          </w:p>
+        </w:tc>
+        <w:tc>
+          <w:tcPr>
+            <w:tcW w:type="dxa" w:w="3024"/>
+            <w:shd w:val="clear" w:color="auto" w:fill="E6F2F6"/>
+          </w:tcPr>
+          <w:p>
+            <w:pPr>
+              <w:spacing w:before="40" w:after="40"/>
+            </w:pPr>
+            <w:r>
+              <w:rPr>
+                <w:color w:val="231F20"/>
+                <w:sz w:val="20"/>
+              </w:rPr>
+              <w:t>Pay only for what you use</w:t>
+            </w:r>
+          </w:p>
+        </w:tc>
+      </w:tr>
+    </w:tbl>
+    <w:p/>
+    <w:p>
+      <w:pPr>
+        <w:spacing w:before="0" w:after="80"/>
+        <w:jc w:val="left"/>
+      </w:pPr>
+      <w:r>
+        <w:rPr>
+          <w:b/>
+          <w:i w:val="0"/>
+          <w:color w:val="005670"/>
+          <w:sz w:val="24"/>
+        </w:rPr>
+        <w:t>The Pitch</w:t>
+      </w:r>
+    </w:p>
+    <w:p>
+      <w:pPr>
+        <w:spacing w:after="120"/>
+        <w:ind w:left="432"/>
+        <w:shd w:val="clear" w:color="auto" w:fill="E6F2F6"/>
+      </w:pPr>
+      <w:r>
+        <w:rPr>
+          <w:b/>
+          <w:i/>
+          <w:color w:val="005670"/>
+          <w:sz w:val="22"/>
+        </w:rPr>
+        <w:t>"Microsoft Copilot searches all your files. We only answer from approved ones — and we tell you exactly which sentence came from which document, and how confident we are. That's the difference between a general AI assistant and a governed enterprise knowledge system."</w:t>
+      </w:r>
+    </w:p>
+    <w:p/>
+    <w:sectPr>
+      <w:pgSz w:w="12240" w:h="15840"/>
+      <w:pgMar w:top="1134" w:right="1417" w:bottom="1134" w:left="1417" w:header="720" w:footer="720" w:gutter="0"/>
+      <w:cols w:space="720"/>
+      <w:docGrid w:linePitch="360"/>
+    </w:sectPr>
+    <w:p>
       <w:pPr>
         <w:spacing w:before="200" w:after="120"/>
         <w:jc w:val="left"/>
@@ -3520,12 +4735,6 @@
         <w:t>AI Ideathon 2026  ·  Stewart Title Guaranty Company  ·  © 2026 All Rights Reserved</w:t>
       </w:r>
     </w:p>
-    <w:sectPr>
-      <w:pgSz w:w="12240" w:h="15840"/>
-      <w:pgMar w:top="1134" w:right="1417" w:bottom="1134" w:left="1417" w:header="720" w:footer="720" w:gutter="0"/>
-      <w:cols w:space="720"/>
-      <w:docGrid w:linePitch="360"/>
-    </w:sectPr>
   </w:body>
 </w:document>
 </file>

</xml_diff>